<commit_message>
Coplete laboratory 2 OS, 5 KMS,
</commit_message>
<xml_diff>
--- a/OS/Laboratory_03/Отчет_ЛР3_шаблон_оценка_10.docx
+++ b/OS/Laboratory_03/Отчет_ЛР3_шаблон_оценка_10.docx
@@ -242,7 +242,7 @@
       <w:r>
         <w:fldChar w:fldCharType="separate"/>
       </w:r>
-      <w:hyperlink w:anchor="_Toc241565608" w:history="1">
+      <w:hyperlink w:anchor="_Toc241609296" w:history="1">
         <w:r>
           <w:rPr>
             <w:rStyle w:val="aff8"/>
@@ -269,7 +269,7 @@
             <w:noProof/>
             <w:webHidden/>
           </w:rPr>
-          <w:instrText xml:space="preserve"> PAGEREF _Toc241565608 \h </w:instrText>
+          <w:instrText xml:space="preserve"> PAGEREF _Toc241609296 \h </w:instrText>
         </w:r>
         <w:r>
           <w:rPr>
@@ -314,7 +314,7 @@
           <w:lang w:val="ru-RU" w:eastAsia="ru-RU"/>
         </w:rPr>
       </w:pPr>
-      <w:hyperlink w:anchor="_Toc241565609" w:history="1">
+      <w:hyperlink w:anchor="_Toc241609297" w:history="1">
         <w:r>
           <w:rPr>
             <w:rStyle w:val="aff8"/>
@@ -341,7 +341,7 @@
             <w:noProof/>
             <w:webHidden/>
           </w:rPr>
-          <w:instrText xml:space="preserve"> PAGEREF _Toc241565609 \h </w:instrText>
+          <w:instrText xml:space="preserve"> PAGEREF _Toc241609297 \h </w:instrText>
         </w:r>
         <w:r>
           <w:rPr>
@@ -386,7 +386,7 @@
           <w:lang w:val="ru-RU" w:eastAsia="ru-RU"/>
         </w:rPr>
       </w:pPr>
-      <w:hyperlink w:anchor="_Toc241565610" w:history="1">
+      <w:hyperlink w:anchor="_Toc241609298" w:history="1">
         <w:r>
           <w:rPr>
             <w:rStyle w:val="aff8"/>
@@ -413,7 +413,7 @@
             <w:noProof/>
             <w:webHidden/>
           </w:rPr>
-          <w:instrText xml:space="preserve"> PAGEREF _Toc241565610 \h </w:instrText>
+          <w:instrText xml:space="preserve"> PAGEREF _Toc241609298 \h </w:instrText>
         </w:r>
         <w:r>
           <w:rPr>
@@ -458,7 +458,7 @@
           <w:lang w:val="ru-RU" w:eastAsia="ru-RU"/>
         </w:rPr>
       </w:pPr>
-      <w:hyperlink w:anchor="_Toc241565611" w:history="1">
+      <w:hyperlink w:anchor="_Toc241609299" w:history="1">
         <w:r>
           <w:rPr>
             <w:rStyle w:val="aff8"/>
@@ -485,7 +485,7 @@
             <w:noProof/>
             <w:webHidden/>
           </w:rPr>
-          <w:instrText xml:space="preserve"> PAGEREF _Toc241565611 \h </w:instrText>
+          <w:instrText xml:space="preserve"> PAGEREF _Toc241609299 \h </w:instrText>
         </w:r>
         <w:r>
           <w:rPr>
@@ -530,7 +530,7 @@
           <w:lang w:val="ru-RU" w:eastAsia="ru-RU"/>
         </w:rPr>
       </w:pPr>
-      <w:hyperlink w:anchor="_Toc241565612" w:history="1">
+      <w:hyperlink w:anchor="_Toc241609300" w:history="1">
         <w:r>
           <w:rPr>
             <w:rStyle w:val="aff8"/>
@@ -557,7 +557,7 @@
             <w:noProof/>
             <w:webHidden/>
           </w:rPr>
-          <w:instrText xml:space="preserve"> PAGEREF _Toc241565612 \h </w:instrText>
+          <w:instrText xml:space="preserve"> PAGEREF _Toc241609300 \h </w:instrText>
         </w:r>
         <w:r>
           <w:rPr>
@@ -602,7 +602,7 @@
           <w:lang w:val="ru-RU" w:eastAsia="ru-RU"/>
         </w:rPr>
       </w:pPr>
-      <w:hyperlink w:anchor="_Toc241565613" w:history="1">
+      <w:hyperlink w:anchor="_Toc241609301" w:history="1">
         <w:r>
           <w:rPr>
             <w:rStyle w:val="aff8"/>
@@ -629,7 +629,7 @@
             <w:noProof/>
             <w:webHidden/>
           </w:rPr>
-          <w:instrText xml:space="preserve"> PAGEREF _Toc241565613 \h </w:instrText>
+          <w:instrText xml:space="preserve"> PAGEREF _Toc241609301 \h </w:instrText>
         </w:r>
         <w:r>
           <w:rPr>
@@ -674,7 +674,7 @@
           <w:lang w:val="ru-RU" w:eastAsia="ru-RU"/>
         </w:rPr>
       </w:pPr>
-      <w:hyperlink w:anchor="_Toc241565614" w:history="1">
+      <w:hyperlink w:anchor="_Toc241609302" w:history="1">
         <w:r>
           <w:rPr>
             <w:rStyle w:val="aff8"/>
@@ -701,7 +701,7 @@
             <w:noProof/>
             <w:webHidden/>
           </w:rPr>
-          <w:instrText xml:space="preserve"> PAGEREF _Toc241565614 \h </w:instrText>
+          <w:instrText xml:space="preserve"> PAGEREF _Toc241609302 \h </w:instrText>
         </w:r>
         <w:r>
           <w:rPr>
@@ -746,7 +746,7 @@
           <w:lang w:val="ru-RU" w:eastAsia="ru-RU"/>
         </w:rPr>
       </w:pPr>
-      <w:hyperlink w:anchor="_Toc241565615" w:history="1">
+      <w:hyperlink w:anchor="_Toc241609303" w:history="1">
         <w:r>
           <w:rPr>
             <w:rStyle w:val="aff8"/>
@@ -773,7 +773,7 @@
             <w:noProof/>
             <w:webHidden/>
           </w:rPr>
-          <w:instrText xml:space="preserve"> PAGEREF _Toc241565615 \h </w:instrText>
+          <w:instrText xml:space="preserve"> PAGEREF _Toc241609303 \h </w:instrText>
         </w:r>
         <w:r>
           <w:rPr>
@@ -818,7 +818,7 @@
           <w:lang w:val="ru-RU" w:eastAsia="ru-RU"/>
         </w:rPr>
       </w:pPr>
-      <w:hyperlink w:anchor="_Toc241565616" w:history="1">
+      <w:hyperlink w:anchor="_Toc241609304" w:history="1">
         <w:r>
           <w:rPr>
             <w:rStyle w:val="aff8"/>
@@ -845,7 +845,7 @@
             <w:noProof/>
             <w:webHidden/>
           </w:rPr>
-          <w:instrText xml:space="preserve"> PAGEREF _Toc241565616 \h </w:instrText>
+          <w:instrText xml:space="preserve"> PAGEREF _Toc241609304 \h </w:instrText>
         </w:r>
         <w:r>
           <w:rPr>
@@ -890,7 +890,7 @@
           <w:lang w:val="ru-RU" w:eastAsia="ru-RU"/>
         </w:rPr>
       </w:pPr>
-      <w:hyperlink w:anchor="_Toc241565617" w:history="1">
+      <w:hyperlink w:anchor="_Toc241609305" w:history="1">
         <w:r>
           <w:rPr>
             <w:rStyle w:val="aff8"/>
@@ -917,7 +917,7 @@
             <w:noProof/>
             <w:webHidden/>
           </w:rPr>
-          <w:instrText xml:space="preserve"> PAGEREF _Toc241565617 \h </w:instrText>
+          <w:instrText xml:space="preserve"> PAGEREF _Toc241609305 \h </w:instrText>
         </w:r>
         <w:r>
           <w:rPr>
@@ -962,7 +962,7 @@
           <w:lang w:val="ru-RU" w:eastAsia="ru-RU"/>
         </w:rPr>
       </w:pPr>
-      <w:hyperlink w:anchor="_Toc241565618" w:history="1">
+      <w:hyperlink w:anchor="_Toc241609306" w:history="1">
         <w:r>
           <w:rPr>
             <w:rStyle w:val="aff8"/>
@@ -989,7 +989,7 @@
             <w:noProof/>
             <w:webHidden/>
           </w:rPr>
-          <w:instrText xml:space="preserve"> PAGEREF _Toc241565618 \h </w:instrText>
+          <w:instrText xml:space="preserve"> PAGEREF _Toc241609306 \h </w:instrText>
         </w:r>
         <w:r>
           <w:rPr>
@@ -1034,7 +1034,7 @@
           <w:lang w:val="ru-RU" w:eastAsia="ru-RU"/>
         </w:rPr>
       </w:pPr>
-      <w:hyperlink w:anchor="_Toc241565619" w:history="1">
+      <w:hyperlink w:anchor="_Toc241609307" w:history="1">
         <w:r>
           <w:rPr>
             <w:rStyle w:val="aff8"/>
@@ -1061,7 +1061,7 @@
             <w:noProof/>
             <w:webHidden/>
           </w:rPr>
-          <w:instrText xml:space="preserve"> PAGEREF _Toc241565619 \h </w:instrText>
+          <w:instrText xml:space="preserve"> PAGEREF _Toc241609307 \h </w:instrText>
         </w:r>
         <w:r>
           <w:rPr>
@@ -1106,7 +1106,7 @@
           <w:lang w:val="ru-RU" w:eastAsia="ru-RU"/>
         </w:rPr>
       </w:pPr>
-      <w:hyperlink w:anchor="_Toc241565620" w:history="1">
+      <w:hyperlink w:anchor="_Toc241609308" w:history="1">
         <w:r>
           <w:rPr>
             <w:rStyle w:val="aff8"/>
@@ -1133,7 +1133,7 @@
             <w:noProof/>
             <w:webHidden/>
           </w:rPr>
-          <w:instrText xml:space="preserve"> PAGEREF _Toc241565620 \h </w:instrText>
+          <w:instrText xml:space="preserve"> PAGEREF _Toc241609308 \h </w:instrText>
         </w:r>
         <w:r>
           <w:rPr>
@@ -1178,7 +1178,7 @@
           <w:lang w:val="ru-RU" w:eastAsia="ru-RU"/>
         </w:rPr>
       </w:pPr>
-      <w:hyperlink w:anchor="_Toc241565621" w:history="1">
+      <w:hyperlink w:anchor="_Toc241609309" w:history="1">
         <w:r>
           <w:rPr>
             <w:rStyle w:val="aff8"/>
@@ -1205,7 +1205,7 @@
             <w:noProof/>
             <w:webHidden/>
           </w:rPr>
-          <w:instrText xml:space="preserve"> PAGEREF _Toc241565621 \h </w:instrText>
+          <w:instrText xml:space="preserve"> PAGEREF _Toc241609309 \h </w:instrText>
         </w:r>
         <w:r>
           <w:rPr>
@@ -1250,7 +1250,7 @@
           <w:lang w:val="ru-RU" w:eastAsia="ru-RU"/>
         </w:rPr>
       </w:pPr>
-      <w:hyperlink w:anchor="_Toc241565622" w:history="1">
+      <w:hyperlink w:anchor="_Toc241609310" w:history="1">
         <w:r>
           <w:rPr>
             <w:rStyle w:val="aff8"/>
@@ -1277,7 +1277,7 @@
             <w:noProof/>
             <w:webHidden/>
           </w:rPr>
-          <w:instrText xml:space="preserve"> PAGEREF _Toc241565622 \h </w:instrText>
+          <w:instrText xml:space="preserve"> PAGEREF _Toc241609310 \h </w:instrText>
         </w:r>
         <w:r>
           <w:rPr>
@@ -1322,7 +1322,7 @@
           <w:lang w:val="ru-RU" w:eastAsia="ru-RU"/>
         </w:rPr>
       </w:pPr>
-      <w:hyperlink w:anchor="_Toc241565623" w:history="1">
+      <w:hyperlink w:anchor="_Toc241609311" w:history="1">
         <w:r>
           <w:rPr>
             <w:rStyle w:val="aff8"/>
@@ -1349,7 +1349,7 @@
             <w:noProof/>
             <w:webHidden/>
           </w:rPr>
-          <w:instrText xml:space="preserve"> PAGEREF _Toc241565623 \h </w:instrText>
+          <w:instrText xml:space="preserve"> PAGEREF _Toc241609311 \h </w:instrText>
         </w:r>
         <w:r>
           <w:rPr>
@@ -1394,7 +1394,7 @@
           <w:lang w:val="ru-RU" w:eastAsia="ru-RU"/>
         </w:rPr>
       </w:pPr>
-      <w:hyperlink w:anchor="_Toc241565624" w:history="1">
+      <w:hyperlink w:anchor="_Toc241609312" w:history="1">
         <w:r>
           <w:rPr>
             <w:rStyle w:val="aff8"/>
@@ -1421,7 +1421,7 @@
             <w:noProof/>
             <w:webHidden/>
           </w:rPr>
-          <w:instrText xml:space="preserve"> PAGEREF _Toc241565624 \h </w:instrText>
+          <w:instrText xml:space="preserve"> PAGEREF _Toc241609312 \h </w:instrText>
         </w:r>
         <w:r>
           <w:rPr>
@@ -1466,7 +1466,7 @@
           <w:lang w:val="ru-RU" w:eastAsia="ru-RU"/>
         </w:rPr>
       </w:pPr>
-      <w:hyperlink w:anchor="_Toc241565625" w:history="1">
+      <w:hyperlink w:anchor="_Toc241609313" w:history="1">
         <w:r>
           <w:rPr>
             <w:rStyle w:val="aff8"/>
@@ -1493,7 +1493,7 @@
             <w:noProof/>
             <w:webHidden/>
           </w:rPr>
-          <w:instrText xml:space="preserve"> PAGEREF _Toc241565625 \h </w:instrText>
+          <w:instrText xml:space="preserve"> PAGEREF _Toc241609313 \h </w:instrText>
         </w:r>
         <w:r>
           <w:rPr>
@@ -1538,7 +1538,7 @@
           <w:lang w:val="ru-RU" w:eastAsia="ru-RU"/>
         </w:rPr>
       </w:pPr>
-      <w:hyperlink w:anchor="_Toc241565626" w:history="1">
+      <w:hyperlink w:anchor="_Toc241609314" w:history="1">
         <w:r>
           <w:rPr>
             <w:rStyle w:val="aff8"/>
@@ -1565,7 +1565,7 @@
             <w:noProof/>
             <w:webHidden/>
           </w:rPr>
-          <w:instrText xml:space="preserve"> PAGEREF _Toc241565626 \h </w:instrText>
+          <w:instrText xml:space="preserve"> PAGEREF _Toc241609314 \h </w:instrText>
         </w:r>
         <w:r>
           <w:rPr>
@@ -1610,7 +1610,7 @@
           <w:lang w:val="ru-RU" w:eastAsia="ru-RU"/>
         </w:rPr>
       </w:pPr>
-      <w:hyperlink w:anchor="_Toc241565627" w:history="1">
+      <w:hyperlink w:anchor="_Toc241609315" w:history="1">
         <w:r>
           <w:rPr>
             <w:rStyle w:val="aff8"/>
@@ -1637,7 +1637,7 @@
             <w:noProof/>
             <w:webHidden/>
           </w:rPr>
-          <w:instrText xml:space="preserve"> PAGEREF _Toc241565627 \h </w:instrText>
+          <w:instrText xml:space="preserve"> PAGEREF _Toc241609315 \h </w:instrText>
         </w:r>
         <w:r>
           <w:rPr>
@@ -1682,7 +1682,7 @@
           <w:lang w:val="ru-RU" w:eastAsia="ru-RU"/>
         </w:rPr>
       </w:pPr>
-      <w:hyperlink w:anchor="_Toc241565628" w:history="1">
+      <w:hyperlink w:anchor="_Toc241609316" w:history="1">
         <w:r>
           <w:rPr>
             <w:rStyle w:val="aff8"/>
@@ -1709,7 +1709,7 @@
             <w:noProof/>
             <w:webHidden/>
           </w:rPr>
-          <w:instrText xml:space="preserve"> PAGEREF _Toc241565628 \h </w:instrText>
+          <w:instrText xml:space="preserve"> PAGEREF _Toc241609316 \h </w:instrText>
         </w:r>
         <w:r>
           <w:rPr>
@@ -1754,7 +1754,7 @@
           <w:lang w:val="ru-RU" w:eastAsia="ru-RU"/>
         </w:rPr>
       </w:pPr>
-      <w:hyperlink w:anchor="_Toc241565629" w:history="1">
+      <w:hyperlink w:anchor="_Toc241609317" w:history="1">
         <w:r>
           <w:rPr>
             <w:rStyle w:val="aff8"/>
@@ -1781,7 +1781,7 @@
             <w:noProof/>
             <w:webHidden/>
           </w:rPr>
-          <w:instrText xml:space="preserve"> PAGEREF _Toc241565629 \h </w:instrText>
+          <w:instrText xml:space="preserve"> PAGEREF _Toc241609317 \h </w:instrText>
         </w:r>
         <w:r>
           <w:rPr>
@@ -1826,7 +1826,7 @@
           <w:lang w:val="ru-RU" w:eastAsia="ru-RU"/>
         </w:rPr>
       </w:pPr>
-      <w:hyperlink w:anchor="_Toc241565630" w:history="1">
+      <w:hyperlink w:anchor="_Toc241609318" w:history="1">
         <w:r>
           <w:rPr>
             <w:rStyle w:val="aff8"/>
@@ -1853,7 +1853,7 @@
             <w:noProof/>
             <w:webHidden/>
           </w:rPr>
-          <w:instrText xml:space="preserve"> PAGEREF _Toc241565630 \h </w:instrText>
+          <w:instrText xml:space="preserve"> PAGEREF _Toc241609318 \h </w:instrText>
         </w:r>
         <w:r>
           <w:rPr>
@@ -1898,7 +1898,7 @@
           <w:lang w:val="ru-RU" w:eastAsia="ru-RU"/>
         </w:rPr>
       </w:pPr>
-      <w:hyperlink w:anchor="_Toc241565631" w:history="1">
+      <w:hyperlink w:anchor="_Toc241609319" w:history="1">
         <w:r>
           <w:rPr>
             <w:rStyle w:val="aff8"/>
@@ -1925,7 +1925,7 @@
             <w:noProof/>
             <w:webHidden/>
           </w:rPr>
-          <w:instrText xml:space="preserve"> PAGEREF _Toc241565631 \h </w:instrText>
+          <w:instrText xml:space="preserve"> PAGEREF _Toc241609319 \h </w:instrText>
         </w:r>
         <w:r>
           <w:rPr>
@@ -1970,7 +1970,7 @@
           <w:lang w:val="ru-RU" w:eastAsia="ru-RU"/>
         </w:rPr>
       </w:pPr>
-      <w:hyperlink w:anchor="_Toc241565632" w:history="1">
+      <w:hyperlink w:anchor="_Toc241609320" w:history="1">
         <w:r>
           <w:rPr>
             <w:rStyle w:val="aff8"/>
@@ -1997,7 +1997,7 @@
             <w:noProof/>
             <w:webHidden/>
           </w:rPr>
-          <w:instrText xml:space="preserve"> PAGEREF _Toc241565632 \h </w:instrText>
+          <w:instrText xml:space="preserve"> PAGEREF _Toc241609320 \h </w:instrText>
         </w:r>
         <w:r>
           <w:rPr>
@@ -2042,7 +2042,7 @@
           <w:lang w:val="ru-RU" w:eastAsia="ru-RU"/>
         </w:rPr>
       </w:pPr>
-      <w:hyperlink w:anchor="_Toc241565633" w:history="1">
+      <w:hyperlink w:anchor="_Toc241609321" w:history="1">
         <w:r>
           <w:rPr>
             <w:rStyle w:val="aff8"/>
@@ -2069,7 +2069,7 @@
             <w:noProof/>
             <w:webHidden/>
           </w:rPr>
-          <w:instrText xml:space="preserve"> PAGEREF _Toc241565633 \h </w:instrText>
+          <w:instrText xml:space="preserve"> PAGEREF _Toc241609321 \h </w:instrText>
         </w:r>
         <w:r>
           <w:rPr>
@@ -2114,7 +2114,7 @@
           <w:lang w:val="ru-RU" w:eastAsia="ru-RU"/>
         </w:rPr>
       </w:pPr>
-      <w:hyperlink w:anchor="_Toc241565634" w:history="1">
+      <w:hyperlink w:anchor="_Toc241609322" w:history="1">
         <w:r>
           <w:rPr>
             <w:rStyle w:val="aff8"/>
@@ -2141,7 +2141,7 @@
             <w:noProof/>
             <w:webHidden/>
           </w:rPr>
-          <w:instrText xml:space="preserve"> PAGEREF _Toc241565634 \h </w:instrText>
+          <w:instrText xml:space="preserve"> PAGEREF _Toc241609322 \h </w:instrText>
         </w:r>
         <w:r>
           <w:rPr>
@@ -2186,7 +2186,7 @@
           <w:lang w:val="ru-RU" w:eastAsia="ru-RU"/>
         </w:rPr>
       </w:pPr>
-      <w:hyperlink w:anchor="_Toc241565635" w:history="1">
+      <w:hyperlink w:anchor="_Toc241609323" w:history="1">
         <w:r>
           <w:rPr>
             <w:rStyle w:val="aff8"/>
@@ -2213,7 +2213,7 @@
             <w:noProof/>
             <w:webHidden/>
           </w:rPr>
-          <w:instrText xml:space="preserve"> PAGEREF _Toc241565635 \h </w:instrText>
+          <w:instrText xml:space="preserve"> PAGEREF _Toc241609323 \h </w:instrText>
         </w:r>
         <w:r>
           <w:rPr>
@@ -2258,7 +2258,7 @@
           <w:lang w:val="ru-RU" w:eastAsia="ru-RU"/>
         </w:rPr>
       </w:pPr>
-      <w:hyperlink w:anchor="_Toc241565636" w:history="1">
+      <w:hyperlink w:anchor="_Toc241609324" w:history="1">
         <w:r>
           <w:rPr>
             <w:rStyle w:val="aff8"/>
@@ -2285,7 +2285,7 @@
             <w:noProof/>
             <w:webHidden/>
           </w:rPr>
-          <w:instrText xml:space="preserve"> PAGEREF _Toc241565636 \h </w:instrText>
+          <w:instrText xml:space="preserve"> PAGEREF _Toc241609324 \h </w:instrText>
         </w:r>
         <w:r>
           <w:rPr>
@@ -2330,7 +2330,7 @@
           <w:lang w:val="ru-RU" w:eastAsia="ru-RU"/>
         </w:rPr>
       </w:pPr>
-      <w:hyperlink w:anchor="_Toc241565637" w:history="1">
+      <w:hyperlink w:anchor="_Toc241609325" w:history="1">
         <w:r>
           <w:rPr>
             <w:rStyle w:val="aff8"/>
@@ -2357,7 +2357,7 @@
             <w:noProof/>
             <w:webHidden/>
           </w:rPr>
-          <w:instrText xml:space="preserve"> PAGEREF _Toc241565637 \h </w:instrText>
+          <w:instrText xml:space="preserve"> PAGEREF _Toc241609325 \h </w:instrText>
         </w:r>
         <w:r>
           <w:rPr>
@@ -2402,7 +2402,7 @@
           <w:lang w:val="ru-RU" w:eastAsia="ru-RU"/>
         </w:rPr>
       </w:pPr>
-      <w:hyperlink w:anchor="_Toc241565638" w:history="1">
+      <w:hyperlink w:anchor="_Toc241609326" w:history="1">
         <w:r>
           <w:rPr>
             <w:rStyle w:val="aff8"/>
@@ -2429,7 +2429,7 @@
             <w:noProof/>
             <w:webHidden/>
           </w:rPr>
-          <w:instrText xml:space="preserve"> PAGEREF _Toc241565638 \h </w:instrText>
+          <w:instrText xml:space="preserve"> PAGEREF _Toc241609326 \h </w:instrText>
         </w:r>
         <w:r>
           <w:rPr>
@@ -2474,7 +2474,7 @@
           <w:lang w:val="ru-RU" w:eastAsia="ru-RU"/>
         </w:rPr>
       </w:pPr>
-      <w:hyperlink w:anchor="_Toc241565639" w:history="1">
+      <w:hyperlink w:anchor="_Toc241609327" w:history="1">
         <w:r>
           <w:rPr>
             <w:rStyle w:val="aff8"/>
@@ -2501,7 +2501,7 @@
             <w:noProof/>
             <w:webHidden/>
           </w:rPr>
-          <w:instrText xml:space="preserve"> PAGEREF _Toc241565639 \h </w:instrText>
+          <w:instrText xml:space="preserve"> PAGEREF _Toc241609327 \h </w:instrText>
         </w:r>
         <w:r>
           <w:rPr>
@@ -2546,7 +2546,7 @@
           <w:lang w:val="ru-RU" w:eastAsia="ru-RU"/>
         </w:rPr>
       </w:pPr>
-      <w:hyperlink w:anchor="_Toc241565640" w:history="1">
+      <w:hyperlink w:anchor="_Toc241609328" w:history="1">
         <w:r>
           <w:rPr>
             <w:rStyle w:val="aff8"/>
@@ -2573,7 +2573,7 @@
             <w:noProof/>
             <w:webHidden/>
           </w:rPr>
-          <w:instrText xml:space="preserve"> PAGEREF _Toc241565640 \h </w:instrText>
+          <w:instrText xml:space="preserve"> PAGEREF _Toc241609328 \h </w:instrText>
         </w:r>
         <w:r>
           <w:rPr>
@@ -2618,7 +2618,7 @@
           <w:lang w:val="ru-RU" w:eastAsia="ru-RU"/>
         </w:rPr>
       </w:pPr>
-      <w:hyperlink w:anchor="_Toc241565641" w:history="1">
+      <w:hyperlink w:anchor="_Toc241609329" w:history="1">
         <w:r>
           <w:rPr>
             <w:rStyle w:val="aff8"/>
@@ -2645,7 +2645,7 @@
             <w:noProof/>
             <w:webHidden/>
           </w:rPr>
-          <w:instrText xml:space="preserve"> PAGEREF _Toc241565641 \h </w:instrText>
+          <w:instrText xml:space="preserve"> PAGEREF _Toc241609329 \h </w:instrText>
         </w:r>
         <w:r>
           <w:rPr>
@@ -2690,7 +2690,7 @@
           <w:lang w:val="ru-RU" w:eastAsia="ru-RU"/>
         </w:rPr>
       </w:pPr>
-      <w:hyperlink w:anchor="_Toc241565642" w:history="1">
+      <w:hyperlink w:anchor="_Toc241609330" w:history="1">
         <w:r>
           <w:rPr>
             <w:rStyle w:val="aff8"/>
@@ -2717,7 +2717,7 @@
             <w:noProof/>
             <w:webHidden/>
           </w:rPr>
-          <w:instrText xml:space="preserve"> PAGEREF _Toc241565642 \h </w:instrText>
+          <w:instrText xml:space="preserve"> PAGEREF _Toc241609330 \h </w:instrText>
         </w:r>
         <w:r>
           <w:rPr>
@@ -2762,7 +2762,7 @@
           <w:lang w:val="ru-RU" w:eastAsia="ru-RU"/>
         </w:rPr>
       </w:pPr>
-      <w:hyperlink w:anchor="_Toc241565643" w:history="1">
+      <w:hyperlink w:anchor="_Toc241609331" w:history="1">
         <w:r>
           <w:rPr>
             <w:rStyle w:val="aff8"/>
@@ -2789,7 +2789,7 @@
             <w:noProof/>
             <w:webHidden/>
           </w:rPr>
-          <w:instrText xml:space="preserve"> PAGEREF _Toc241565643 \h </w:instrText>
+          <w:instrText xml:space="preserve"> PAGEREF _Toc241609331 \h </w:instrText>
         </w:r>
         <w:r>
           <w:rPr>
@@ -2834,7 +2834,7 @@
           <w:lang w:val="ru-RU" w:eastAsia="ru-RU"/>
         </w:rPr>
       </w:pPr>
-      <w:hyperlink w:anchor="_Toc241565644" w:history="1">
+      <w:hyperlink w:anchor="_Toc241609332" w:history="1">
         <w:r>
           <w:rPr>
             <w:rStyle w:val="aff8"/>
@@ -2861,7 +2861,7 @@
             <w:noProof/>
             <w:webHidden/>
           </w:rPr>
-          <w:instrText xml:space="preserve"> PAGEREF _Toc241565644 \h </w:instrText>
+          <w:instrText xml:space="preserve"> PAGEREF _Toc241609332 \h </w:instrText>
         </w:r>
         <w:r>
           <w:rPr>
@@ -2904,7 +2904,7 @@
       <w:pPr>
         <w:pStyle w:val="1"/>
       </w:pPr>
-      <w:bookmarkStart w:id="0" w:name="_Toc241565608"/>
+      <w:bookmarkStart w:id="0" w:name="_Toc241609296"/>
       <w:r>
         <w:rPr>
           <w:rFonts w:ascii="Times New Roman" w:eastAsia="Times New Roman" w:hAnsi="Times New Roman" w:cs="Times New Roman"/>
@@ -2980,7 +2980,7 @@
       <w:pPr>
         <w:pStyle w:val="1"/>
       </w:pPr>
-      <w:bookmarkStart w:id="1" w:name="_Toc241565609"/>
+      <w:bookmarkStart w:id="1" w:name="_Toc241609297"/>
       <w:r>
         <w:rPr>
           <w:rFonts w:ascii="Times New Roman" w:eastAsia="Times New Roman" w:hAnsi="Times New Roman" w:cs="Times New Roman"/>
@@ -2994,7 +2994,7 @@
       <w:pPr>
         <w:pStyle w:val="21"/>
       </w:pPr>
-      <w:bookmarkStart w:id="2" w:name="_Toc241565610"/>
+      <w:bookmarkStart w:id="2" w:name="_Toc241609298"/>
       <w:r>
         <w:rPr>
           <w:rFonts w:ascii="Times New Roman" w:eastAsia="Times New Roman" w:hAnsi="Times New Roman" w:cs="Times New Roman"/>
@@ -3026,7 +3026,7 @@
       <w:pPr>
         <w:pStyle w:val="21"/>
       </w:pPr>
-      <w:bookmarkStart w:id="3" w:name="_Toc241565611"/>
+      <w:bookmarkStart w:id="3" w:name="_Toc241609299"/>
       <w:r>
         <w:rPr>
           <w:rFonts w:ascii="Times New Roman" w:eastAsia="Times New Roman" w:hAnsi="Times New Roman" w:cs="Times New Roman"/>
@@ -3074,6 +3074,7 @@
       </w:tblGrid>
       <w:tr>
         <w:trPr>
+          <w:tblHeader/>
           <w:jc w:val="center"/>
         </w:trPr>
         <w:tc>
@@ -3571,7 +3572,7 @@
       <w:pPr>
         <w:pStyle w:val="1"/>
       </w:pPr>
-      <w:bookmarkStart w:id="4" w:name="_Toc241565612"/>
+      <w:bookmarkStart w:id="4" w:name="_Toc241609300"/>
       <w:r>
         <w:rPr>
           <w:rFonts w:ascii="Times New Roman" w:eastAsia="Times New Roman" w:hAnsi="Times New Roman" w:cs="Times New Roman"/>
@@ -3585,7 +3586,7 @@
       <w:pPr>
         <w:pStyle w:val="21"/>
       </w:pPr>
-      <w:bookmarkStart w:id="5" w:name="_Toc241565613"/>
+      <w:bookmarkStart w:id="5" w:name="_Toc241609301"/>
       <w:r>
         <w:rPr>
           <w:rFonts w:ascii="Times New Roman" w:eastAsia="Times New Roman" w:hAnsi="Times New Roman" w:cs="Times New Roman"/>
@@ -3644,6 +3645,7 @@
       </w:tblGrid>
       <w:tr>
         <w:trPr>
+          <w:tblHeader/>
           <w:jc w:val="center"/>
         </w:trPr>
         <w:tc>
@@ -3941,10 +3943,10 @@
           <w:noProof/>
         </w:rPr>
         <w:drawing>
-          <wp:inline distT="0" distB="0" distL="0" distR="0" wp14:anchorId="25B4BF2F" wp14:editId="2217470E">
+          <wp:inline distT="0" distB="0" distL="0" distR="0" wp14:anchorId="29E618C0" wp14:editId="7B503D83">
             <wp:extent cx="5328000" cy="2202240"/>
             <wp:effectExtent l="0" t="0" r="0" b="0"/>
-            <wp:docPr id="1" name="Picture 1"/>
+            <wp:docPr id="1" name="Picture 1" descr="Заменить собственным скриншотом: Запуски Lab-03x с аргументом и переменной ITER_NUM" title="Место для рисунка 2.1"/>
             <wp:cNvGraphicFramePr>
               <a:graphicFrameLocks xmlns:a="http://schemas.openxmlformats.org/drawingml/2006/main" noChangeAspect="1"/>
             </wp:cNvGraphicFramePr>
@@ -4000,7 +4002,7 @@
       <w:pPr>
         <w:pStyle w:val="21"/>
       </w:pPr>
-      <w:bookmarkStart w:id="6" w:name="_Toc241565614"/>
+      <w:bookmarkStart w:id="6" w:name="_Toc241609302"/>
       <w:r>
         <w:rPr>
           <w:rFonts w:ascii="Times New Roman" w:eastAsia="Times New Roman" w:hAnsi="Times New Roman" w:cs="Times New Roman"/>
@@ -4060,6 +4062,7 @@
       </w:tblGrid>
       <w:tr>
         <w:trPr>
+          <w:tblHeader/>
           <w:jc w:val="center"/>
         </w:trPr>
         <w:tc>
@@ -4304,10 +4307,10 @@
           <w:noProof/>
         </w:rPr>
         <w:drawing>
-          <wp:inline distT="0" distB="0" distL="0" distR="0" wp14:anchorId="720D9F2A" wp14:editId="0FA003DC">
+          <wp:inline distT="0" distB="0" distL="0" distR="0" wp14:anchorId="5054BA88" wp14:editId="5D84DBA1">
             <wp:extent cx="5328000" cy="2202240"/>
             <wp:effectExtent l="0" t="0" r="0" b="0"/>
-            <wp:docPr id="2" name="Picture 2"/>
+            <wp:docPr id="2" name="Picture 2" descr="Заменить собственным скриншотом: Создание дочерних процессов приложением Lab-03a" title="Место для рисунка 2.2"/>
             <wp:cNvGraphicFramePr>
               <a:graphicFrameLocks xmlns:a="http://schemas.openxmlformats.org/drawingml/2006/main" noChangeAspect="1"/>
             </wp:cNvGraphicFramePr>
@@ -4380,10 +4383,10 @@
           <w:noProof/>
         </w:rPr>
         <w:drawing>
-          <wp:inline distT="0" distB="0" distL="0" distR="0" wp14:anchorId="08C0D8E1" wp14:editId="694CEDED">
+          <wp:inline distT="0" distB="0" distL="0" distR="0" wp14:anchorId="4CEAA2BA" wp14:editId="6071A158">
             <wp:extent cx="5328000" cy="2202240"/>
             <wp:effectExtent l="0" t="0" r="0" b="0"/>
-            <wp:docPr id="3" name="Picture 3"/>
+            <wp:docPr id="3" name="Picture 3" descr="Заменить собственным скриншотом: Дерево процессов Lab-03a в Process Explorer" title="Место для рисунка 2.3"/>
             <wp:cNvGraphicFramePr>
               <a:graphicFrameLocks xmlns:a="http://schemas.openxmlformats.org/drawingml/2006/main" noChangeAspect="1"/>
             </wp:cNvGraphicFramePr>
@@ -4455,10 +4458,10 @@
           <w:noProof/>
         </w:rPr>
         <w:drawing>
-          <wp:inline distT="0" distB="0" distL="0" distR="0" wp14:anchorId="47509429" wp14:editId="7950B46B">
+          <wp:inline distT="0" distB="0" distL="0" distR="0" wp14:anchorId="02479CC4" wp14:editId="1055BEFB">
             <wp:extent cx="5328000" cy="2202240"/>
             <wp:effectExtent l="0" t="0" r="0" b="0"/>
-            <wp:docPr id="4" name="Picture 4"/>
+            <wp:docPr id="4" name="Picture 4" descr="Заменить собственным скриншотом: Дескрипторы дочерних процессов у Lab-03a" title="Место для рисунка 2.4"/>
             <wp:cNvGraphicFramePr>
               <a:graphicFrameLocks xmlns:a="http://schemas.openxmlformats.org/drawingml/2006/main" noChangeAspect="1"/>
             </wp:cNvGraphicFramePr>
@@ -4514,7 +4517,7 @@
       <w:pPr>
         <w:pStyle w:val="21"/>
       </w:pPr>
-      <w:bookmarkStart w:id="7" w:name="_Toc241565615"/>
+      <w:bookmarkStart w:id="7" w:name="_Toc241609303"/>
       <w:r>
         <w:rPr>
           <w:rFonts w:ascii="Times New Roman" w:eastAsia="Times New Roman" w:hAnsi="Times New Roman" w:cs="Times New Roman"/>
@@ -4563,6 +4566,7 @@
       </w:tblGrid>
       <w:tr>
         <w:trPr>
+          <w:tblHeader/>
           <w:jc w:val="center"/>
         </w:trPr>
         <w:tc>
@@ -4857,10 +4861,10 @@
           <w:noProof/>
         </w:rPr>
         <w:drawing>
-          <wp:inline distT="0" distB="0" distL="0" distR="0" wp14:anchorId="282670AC" wp14:editId="65BD3D71">
+          <wp:inline distT="0" distB="0" distL="0" distR="0" wp14:anchorId="448C6A5E" wp14:editId="59D9780E">
             <wp:extent cx="5328000" cy="2202240"/>
             <wp:effectExtent l="0" t="0" r="0" b="0"/>
-            <wp:docPr id="5" name="Picture 5"/>
+            <wp:docPr id="5" name="Picture 5" descr="Заменить собственным скриншотом: Пользовательская переменная окружения ITER_NUM" title="Место для рисунка 2.5"/>
             <wp:cNvGraphicFramePr>
               <a:graphicFrameLocks xmlns:a="http://schemas.openxmlformats.org/drawingml/2006/main" noChangeAspect="1"/>
             </wp:cNvGraphicFramePr>
@@ -4916,7 +4920,7 @@
       <w:pPr>
         <w:pStyle w:val="21"/>
       </w:pPr>
-      <w:bookmarkStart w:id="8" w:name="_Toc241565616"/>
+      <w:bookmarkStart w:id="8" w:name="_Toc241609304"/>
       <w:r>
         <w:rPr>
           <w:rFonts w:ascii="Times New Roman" w:eastAsia="Times New Roman" w:hAnsi="Times New Roman" w:cs="Times New Roman"/>
@@ -4960,10 +4964,10 @@
           <w:noProof/>
         </w:rPr>
         <w:drawing>
-          <wp:inline distT="0" distB="0" distL="0" distR="0" wp14:anchorId="27EAF26B" wp14:editId="7B62A897">
+          <wp:inline distT="0" distB="0" distL="0" distR="0" wp14:anchorId="06DF9E1C" wp14:editId="4BC156A9">
             <wp:extent cx="5328000" cy="2202240"/>
             <wp:effectExtent l="0" t="0" r="0" b="0"/>
-            <wp:docPr id="6" name="Picture 6"/>
+            <wp:docPr id="6" name="Picture 6" descr="Заменить собственным скриншотом: Количество итераций дочерних процессов Lab-03b" title="Место для рисунка 2.6"/>
             <wp:cNvGraphicFramePr>
               <a:graphicFrameLocks xmlns:a="http://schemas.openxmlformats.org/drawingml/2006/main" noChangeAspect="1"/>
             </wp:cNvGraphicFramePr>
@@ -5016,7 +5020,7 @@
       <w:pPr>
         <w:pStyle w:val="21"/>
       </w:pPr>
-      <w:bookmarkStart w:id="9" w:name="_Toc241565617"/>
+      <w:bookmarkStart w:id="9" w:name="_Toc241609305"/>
       <w:r>
         <w:rPr>
           <w:rFonts w:ascii="Times New Roman" w:eastAsia="Times New Roman" w:hAnsi="Times New Roman" w:cs="Times New Roman"/>
@@ -5053,10 +5057,10 @@
           <w:noProof/>
         </w:rPr>
         <w:drawing>
-          <wp:inline distT="0" distB="0" distL="0" distR="0" wp14:anchorId="12EAB221" wp14:editId="50C04679">
+          <wp:inline distT="0" distB="0" distL="0" distR="0" wp14:anchorId="53267DF7" wp14:editId="06BB4E24">
             <wp:extent cx="5328000" cy="2202240"/>
             <wp:effectExtent l="0" t="0" r="0" b="0"/>
-            <wp:docPr id="7" name="Picture 7"/>
+            <wp:docPr id="7" name="Picture 7" descr="Заменить собственным скриншотом: Список процессов, сформированный Lab-03c" title="Место для рисунка 2.7"/>
             <wp:cNvGraphicFramePr>
               <a:graphicFrameLocks xmlns:a="http://schemas.openxmlformats.org/drawingml/2006/main" noChangeAspect="1"/>
             </wp:cNvGraphicFramePr>
@@ -5112,7 +5116,7 @@
       <w:pPr>
         <w:pStyle w:val="1"/>
       </w:pPr>
-      <w:bookmarkStart w:id="10" w:name="_Toc241565618"/>
+      <w:bookmarkStart w:id="10" w:name="_Toc241609306"/>
       <w:r>
         <w:rPr>
           <w:rFonts w:ascii="Times New Roman" w:eastAsia="Times New Roman" w:hAnsi="Times New Roman" w:cs="Times New Roman"/>
@@ -5126,7 +5130,7 @@
       <w:pPr>
         <w:pStyle w:val="21"/>
       </w:pPr>
-      <w:bookmarkStart w:id="11" w:name="_Toc241565619"/>
+      <w:bookmarkStart w:id="11" w:name="_Toc241609307"/>
       <w:r>
         <w:rPr>
           <w:rFonts w:ascii="Times New Roman" w:eastAsia="Times New Roman" w:hAnsi="Times New Roman" w:cs="Times New Roman"/>
@@ -5147,7 +5151,7 @@
       <w:pPr>
         <w:pStyle w:val="21"/>
       </w:pPr>
-      <w:bookmarkStart w:id="12" w:name="_Toc241565620"/>
+      <w:bookmarkStart w:id="12" w:name="_Toc241609308"/>
       <w:r>
         <w:rPr>
           <w:rFonts w:ascii="Times New Roman" w:eastAsia="Times New Roman" w:hAnsi="Times New Roman" w:cs="Times New Roman"/>
@@ -5206,6 +5210,7 @@
       </w:tblGrid>
       <w:tr>
         <w:trPr>
+          <w:tblHeader/>
           <w:jc w:val="center"/>
         </w:trPr>
         <w:tc>
@@ -5551,10 +5556,10 @@
           <w:noProof/>
         </w:rPr>
         <w:drawing>
-          <wp:inline distT="0" distB="0" distL="0" distR="0" wp14:anchorId="7B5C696B" wp14:editId="2345296E">
+          <wp:inline distT="0" distB="0" distL="0" distR="0" wp14:anchorId="5AB173A6" wp14:editId="64AE8676">
             <wp:extent cx="5328000" cy="2202240"/>
             <wp:effectExtent l="0" t="0" r="0" b="0"/>
-            <wp:docPr id="8" name="Picture 8"/>
+            <wp:docPr id="8" name="Picture 8" descr="Заменить собственным скриншотом: Результат Lab-03d-server для нескольких процессов" title="Место для рисунка 3.1"/>
             <wp:cNvGraphicFramePr>
               <a:graphicFrameLocks xmlns:a="http://schemas.openxmlformats.org/drawingml/2006/main" noChangeAspect="1"/>
             </wp:cNvGraphicFramePr>
@@ -5623,10 +5628,10 @@
           <w:noProof/>
         </w:rPr>
         <w:drawing>
-          <wp:inline distT="0" distB="0" distL="0" distR="0" wp14:anchorId="2F5328AB" wp14:editId="244BFB72">
+          <wp:inline distT="0" distB="0" distL="0" distR="0" wp14:anchorId="166950EF" wp14:editId="6152A229">
             <wp:extent cx="5328000" cy="2202240"/>
             <wp:effectExtent l="0" t="0" r="0" b="0"/>
-            <wp:docPr id="9" name="Picture 9"/>
+            <wp:docPr id="9" name="Picture 9" descr="Заменить собственным скриншотом: Дерево процессов параллельного поиска" title="Место для рисунка 3.2"/>
             <wp:cNvGraphicFramePr>
               <a:graphicFrameLocks xmlns:a="http://schemas.openxmlformats.org/drawingml/2006/main" noChangeAspect="1"/>
             </wp:cNvGraphicFramePr>
@@ -5699,10 +5704,10 @@
           <w:noProof/>
         </w:rPr>
         <w:drawing>
-          <wp:inline distT="0" distB="0" distL="0" distR="0" wp14:anchorId="11F9F74B" wp14:editId="3D90B889">
+          <wp:inline distT="0" distB="0" distL="0" distR="0" wp14:anchorId="3A23E7B8" wp14:editId="0E7D5C1B">
             <wp:extent cx="5328000" cy="2202240"/>
             <wp:effectExtent l="0" t="0" r="0" b="0"/>
-            <wp:docPr id="10" name="Picture 10"/>
+            <wp:docPr id="10" name="Picture 10" descr="Заменить собственным скриншотом: Дескриптор анонимного канала в Process Explorer" title="Место для рисунка 3.3"/>
             <wp:cNvGraphicFramePr>
               <a:graphicFrameLocks xmlns:a="http://schemas.openxmlformats.org/drawingml/2006/main" noChangeAspect="1"/>
             </wp:cNvGraphicFramePr>
@@ -5758,7 +5763,7 @@
       <w:pPr>
         <w:pStyle w:val="1"/>
       </w:pPr>
-      <w:bookmarkStart w:id="13" w:name="_Toc241565621"/>
+      <w:bookmarkStart w:id="13" w:name="_Toc241609309"/>
       <w:r>
         <w:rPr>
           <w:rFonts w:ascii="Times New Roman" w:eastAsia="Times New Roman" w:hAnsi="Times New Roman" w:cs="Times New Roman"/>
@@ -5804,10 +5809,10 @@
           <w:noProof/>
         </w:rPr>
         <w:drawing>
-          <wp:inline distT="0" distB="0" distL="0" distR="0" wp14:anchorId="740433C3" wp14:editId="6042B16E">
+          <wp:inline distT="0" distB="0" distL="0" distR="0" wp14:anchorId="7A433E9D" wp14:editId="00C5FFD4">
             <wp:extent cx="5328000" cy="2202240"/>
             <wp:effectExtent l="0" t="0" r="0" b="0"/>
-            <wp:docPr id="11" name="Picture 11"/>
+            <wp:docPr id="11" name="Picture 11" descr="Заменить собственным скриншотом: Передача фразы через STARTUPINFO" title="Место для рисунка 4.1"/>
             <wp:cNvGraphicFramePr>
               <a:graphicFrameLocks xmlns:a="http://schemas.openxmlformats.org/drawingml/2006/main" noChangeAspect="1"/>
             </wp:cNvGraphicFramePr>
@@ -5863,7 +5868,7 @@
       <w:pPr>
         <w:pStyle w:val="1"/>
       </w:pPr>
-      <w:bookmarkStart w:id="14" w:name="_Toc241565622"/>
+      <w:bookmarkStart w:id="14" w:name="_Toc241609310"/>
       <w:r>
         <w:rPr>
           <w:rFonts w:ascii="Times New Roman" w:eastAsia="Times New Roman" w:hAnsi="Times New Roman" w:cs="Times New Roman"/>
@@ -5877,7 +5882,7 @@
       <w:pPr>
         <w:pStyle w:val="21"/>
       </w:pPr>
-      <w:bookmarkStart w:id="15" w:name="_Toc241565623"/>
+      <w:bookmarkStart w:id="15" w:name="_Toc241609311"/>
       <w:r>
         <w:rPr>
           <w:rFonts w:ascii="Times New Roman" w:eastAsia="Times New Roman" w:hAnsi="Times New Roman" w:cs="Times New Roman"/>
@@ -5936,6 +5941,7 @@
       </w:tblGrid>
       <w:tr>
         <w:trPr>
+          <w:tblHeader/>
           <w:jc w:val="center"/>
         </w:trPr>
         <w:tc>
@@ -6237,10 +6243,10 @@
           <w:noProof/>
         </w:rPr>
         <w:drawing>
-          <wp:inline distT="0" distB="0" distL="0" distR="0" wp14:anchorId="799DB0E2" wp14:editId="3197CBD5">
+          <wp:inline distT="0" distB="0" distL="0" distR="0" wp14:anchorId="46F425FB" wp14:editId="1F61F058">
             <wp:extent cx="5328000" cy="2202240"/>
             <wp:effectExtent l="0" t="0" r="0" b="0"/>
-            <wp:docPr id="12" name="Picture 12"/>
+            <wp:docPr id="12" name="Picture 12" descr="Заменить собственным скриншотом: Параллельный запуск двух процессов Lab-03x" title="Место для рисунка 5.1"/>
             <wp:cNvGraphicFramePr>
               <a:graphicFrameLocks xmlns:a="http://schemas.openxmlformats.org/drawingml/2006/main" noChangeAspect="1"/>
             </wp:cNvGraphicFramePr>
@@ -6313,10 +6319,10 @@
           <w:noProof/>
         </w:rPr>
         <w:drawing>
-          <wp:inline distT="0" distB="0" distL="0" distR="0" wp14:anchorId="27737C6D" wp14:editId="14793778">
+          <wp:inline distT="0" distB="0" distL="0" distR="0" wp14:anchorId="0B4E1CF7" wp14:editId="4EB9DDA9">
             <wp:extent cx="5328000" cy="2202240"/>
             <wp:effectExtent l="0" t="0" r="0" b="0"/>
-            <wp:docPr id="13" name="Picture 13"/>
+            <wp:docPr id="13" name="Picture 13" descr="Заменить собственным скриншотом: Сведения о процессах через ps и каталог proc" title="Место для рисунка 5.2"/>
             <wp:cNvGraphicFramePr>
               <a:graphicFrameLocks xmlns:a="http://schemas.openxmlformats.org/drawingml/2006/main" noChangeAspect="1"/>
             </wp:cNvGraphicFramePr>
@@ -6372,7 +6378,7 @@
       <w:pPr>
         <w:pStyle w:val="1"/>
       </w:pPr>
-      <w:bookmarkStart w:id="16" w:name="_Toc241565624"/>
+      <w:bookmarkStart w:id="16" w:name="_Toc241609312"/>
       <w:r>
         <w:rPr>
           <w:rFonts w:ascii="Times New Roman" w:eastAsia="Times New Roman" w:hAnsi="Times New Roman" w:cs="Times New Roman"/>
@@ -6418,10 +6424,10 @@
           <w:noProof/>
         </w:rPr>
         <w:drawing>
-          <wp:inline distT="0" distB="0" distL="0" distR="0" wp14:anchorId="0951B038" wp14:editId="1DE1FB9C">
+          <wp:inline distT="0" distB="0" distL="0" distR="0" wp14:anchorId="4B79837F" wp14:editId="0FB67695">
             <wp:extent cx="5328000" cy="2202240"/>
             <wp:effectExtent l="0" t="0" r="0" b="0"/>
-            <wp:docPr id="14" name="Picture 14"/>
+            <wp:docPr id="14" name="Picture 14" descr="Заменить собственным скриншотом: Результат параллельного поиска Linux" title="Место для рисунка 6.1"/>
             <wp:cNvGraphicFramePr>
               <a:graphicFrameLocks xmlns:a="http://schemas.openxmlformats.org/drawingml/2006/main" noChangeAspect="1"/>
             </wp:cNvGraphicFramePr>
@@ -6494,10 +6500,10 @@
           <w:noProof/>
         </w:rPr>
         <w:drawing>
-          <wp:inline distT="0" distB="0" distL="0" distR="0" wp14:anchorId="017E4A0C" wp14:editId="64EB4E94">
+          <wp:inline distT="0" distB="0" distL="0" distR="0" wp14:anchorId="65EFE4A1" wp14:editId="3F22DEA9">
             <wp:extent cx="5328000" cy="2202240"/>
             <wp:effectExtent l="0" t="0" r="0" b="0"/>
-            <wp:docPr id="15" name="Picture 15"/>
+            <wp:docPr id="15" name="Picture 15" descr="Заменить собственным скриншотом: Дескрипторы канала в proc" title="Место для рисунка 6.2"/>
             <wp:cNvGraphicFramePr>
               <a:graphicFrameLocks xmlns:a="http://schemas.openxmlformats.org/drawingml/2006/main" noChangeAspect="1"/>
             </wp:cNvGraphicFramePr>
@@ -6550,7 +6556,7 @@
       <w:pPr>
         <w:pStyle w:val="1"/>
       </w:pPr>
-      <w:bookmarkStart w:id="17" w:name="_Toc241565625"/>
+      <w:bookmarkStart w:id="17" w:name="_Toc241609313"/>
       <w:r>
         <w:rPr>
           <w:rFonts w:ascii="Times New Roman" w:eastAsia="Times New Roman" w:hAnsi="Times New Roman" w:cs="Times New Roman"/>
@@ -6610,6 +6616,7 @@
       </w:tblGrid>
       <w:tr>
         <w:trPr>
+          <w:tblHeader/>
           <w:jc w:val="center"/>
         </w:trPr>
         <w:tc>
@@ -6907,10 +6914,10 @@
           <w:noProof/>
         </w:rPr>
         <w:drawing>
-          <wp:inline distT="0" distB="0" distL="0" distR="0" wp14:anchorId="323261A7" wp14:editId="51D91976">
+          <wp:inline distT="0" distB="0" distL="0" distR="0" wp14:anchorId="37C4E1FF" wp14:editId="171EBCFF">
             <wp:extent cx="5328000" cy="2202240"/>
             <wp:effectExtent l="0" t="0" r="0" b="0"/>
-            <wp:docPr id="16" name="Picture 16"/>
+            <wp:docPr id="16" name="Picture 16" descr="Заменить собственным скриншотом: Обработка USR1, USR2, INT и TERM" title="Место для рисунка 7.1"/>
             <wp:cNvGraphicFramePr>
               <a:graphicFrameLocks xmlns:a="http://schemas.openxmlformats.org/drawingml/2006/main" noChangeAspect="1"/>
             </wp:cNvGraphicFramePr>
@@ -6966,7 +6973,7 @@
       <w:pPr>
         <w:pStyle w:val="1"/>
       </w:pPr>
-      <w:bookmarkStart w:id="18" w:name="_Toc241565626"/>
+      <w:bookmarkStart w:id="18" w:name="_Toc241609314"/>
       <w:r>
         <w:rPr>
           <w:rFonts w:ascii="Times New Roman" w:eastAsia="Times New Roman" w:hAnsi="Times New Roman" w:cs="Times New Roman"/>
@@ -6980,7 +6987,7 @@
       <w:pPr>
         <w:pStyle w:val="21"/>
       </w:pPr>
-      <w:bookmarkStart w:id="19" w:name="_Toc241565627"/>
+      <w:bookmarkStart w:id="19" w:name="_Toc241609315"/>
       <w:r>
         <w:rPr>
           <w:rFonts w:ascii="Times New Roman" w:eastAsia="Times New Roman" w:hAnsi="Times New Roman" w:cs="Times New Roman"/>
@@ -7001,7 +7008,7 @@
       <w:pPr>
         <w:pStyle w:val="21"/>
       </w:pPr>
-      <w:bookmarkStart w:id="20" w:name="_Toc241565628"/>
+      <w:bookmarkStart w:id="20" w:name="_Toc241609316"/>
       <w:r>
         <w:rPr>
           <w:rFonts w:ascii="Times New Roman" w:eastAsia="Times New Roman" w:hAnsi="Times New Roman" w:cs="Times New Roman"/>
@@ -7022,7 +7029,7 @@
       <w:pPr>
         <w:pStyle w:val="21"/>
       </w:pPr>
-      <w:bookmarkStart w:id="21" w:name="_Toc241565629"/>
+      <w:bookmarkStart w:id="21" w:name="_Toc241609317"/>
       <w:r>
         <w:rPr>
           <w:rFonts w:ascii="Times New Roman" w:eastAsia="Times New Roman" w:hAnsi="Times New Roman" w:cs="Times New Roman"/>
@@ -7043,7 +7050,7 @@
       <w:pPr>
         <w:pStyle w:val="21"/>
       </w:pPr>
-      <w:bookmarkStart w:id="22" w:name="_Toc241565630"/>
+      <w:bookmarkStart w:id="22" w:name="_Toc241609318"/>
       <w:r>
         <w:rPr>
           <w:rFonts w:ascii="Times New Roman" w:eastAsia="Times New Roman" w:hAnsi="Times New Roman" w:cs="Times New Roman"/>
@@ -7061,7 +7068,7 @@
       <w:pPr>
         <w:pStyle w:val="21"/>
       </w:pPr>
-      <w:bookmarkStart w:id="23" w:name="_Toc241565631"/>
+      <w:bookmarkStart w:id="23" w:name="_Toc241609319"/>
       <w:r>
         <w:rPr>
           <w:rFonts w:ascii="Times New Roman" w:eastAsia="Times New Roman" w:hAnsi="Times New Roman" w:cs="Times New Roman"/>
@@ -7082,7 +7089,7 @@
       <w:pPr>
         <w:pStyle w:val="21"/>
       </w:pPr>
-      <w:bookmarkStart w:id="24" w:name="_Toc241565632"/>
+      <w:bookmarkStart w:id="24" w:name="_Toc241609320"/>
       <w:r>
         <w:rPr>
           <w:rFonts w:ascii="Times New Roman" w:eastAsia="Times New Roman" w:hAnsi="Times New Roman" w:cs="Times New Roman"/>
@@ -7103,7 +7110,7 @@
       <w:pPr>
         <w:pStyle w:val="21"/>
       </w:pPr>
-      <w:bookmarkStart w:id="25" w:name="_Toc241565633"/>
+      <w:bookmarkStart w:id="25" w:name="_Toc241609321"/>
       <w:r>
         <w:rPr>
           <w:rFonts w:ascii="Times New Roman" w:eastAsia="Times New Roman" w:hAnsi="Times New Roman" w:cs="Times New Roman"/>
@@ -7124,7 +7131,7 @@
       <w:pPr>
         <w:pStyle w:val="21"/>
       </w:pPr>
-      <w:bookmarkStart w:id="26" w:name="_Toc241565634"/>
+      <w:bookmarkStart w:id="26" w:name="_Toc241609322"/>
       <w:r>
         <w:rPr>
           <w:rFonts w:ascii="Times New Roman" w:eastAsia="Times New Roman" w:hAnsi="Times New Roman" w:cs="Times New Roman"/>
@@ -7143,7 +7150,7 @@
       <w:pPr>
         <w:pStyle w:val="21"/>
       </w:pPr>
-      <w:bookmarkStart w:id="27" w:name="_Toc241565635"/>
+      <w:bookmarkStart w:id="27" w:name="_Toc241609323"/>
       <w:r>
         <w:rPr>
           <w:rFonts w:ascii="Times New Roman" w:eastAsia="Times New Roman" w:hAnsi="Times New Roman" w:cs="Times New Roman"/>
@@ -7164,7 +7171,7 @@
       <w:pPr>
         <w:pStyle w:val="21"/>
       </w:pPr>
-      <w:bookmarkStart w:id="28" w:name="_Toc241565636"/>
+      <w:bookmarkStart w:id="28" w:name="_Toc241609324"/>
       <w:r>
         <w:rPr>
           <w:rFonts w:ascii="Times New Roman" w:eastAsia="Times New Roman" w:hAnsi="Times New Roman" w:cs="Times New Roman"/>
@@ -7185,7 +7192,7 @@
       <w:pPr>
         <w:pStyle w:val="21"/>
       </w:pPr>
-      <w:bookmarkStart w:id="29" w:name="_Toc241565637"/>
+      <w:bookmarkStart w:id="29" w:name="_Toc241609325"/>
       <w:r>
         <w:rPr>
           <w:rFonts w:ascii="Times New Roman" w:eastAsia="Times New Roman" w:hAnsi="Times New Roman" w:cs="Times New Roman"/>
@@ -7203,7 +7210,7 @@
       <w:pPr>
         <w:pStyle w:val="21"/>
       </w:pPr>
-      <w:bookmarkStart w:id="30" w:name="_Toc241565638"/>
+      <w:bookmarkStart w:id="30" w:name="_Toc241609326"/>
       <w:r>
         <w:rPr>
           <w:rFonts w:ascii="Times New Roman" w:eastAsia="Times New Roman" w:hAnsi="Times New Roman" w:cs="Times New Roman"/>
@@ -7227,7 +7234,7 @@
       <w:pPr>
         <w:pStyle w:val="21"/>
       </w:pPr>
-      <w:bookmarkStart w:id="31" w:name="_Toc241565639"/>
+      <w:bookmarkStart w:id="31" w:name="_Toc241609327"/>
       <w:r>
         <w:rPr>
           <w:rFonts w:ascii="Times New Roman" w:eastAsia="Times New Roman" w:hAnsi="Times New Roman" w:cs="Times New Roman"/>
@@ -7248,7 +7255,7 @@
       <w:pPr>
         <w:pStyle w:val="21"/>
       </w:pPr>
-      <w:bookmarkStart w:id="32" w:name="_Toc241565640"/>
+      <w:bookmarkStart w:id="32" w:name="_Toc241609328"/>
       <w:r>
         <w:rPr>
           <w:rFonts w:ascii="Times New Roman" w:eastAsia="Times New Roman" w:hAnsi="Times New Roman" w:cs="Times New Roman"/>
@@ -7269,7 +7276,7 @@
       <w:pPr>
         <w:pStyle w:val="21"/>
       </w:pPr>
-      <w:bookmarkStart w:id="33" w:name="_Toc241565641"/>
+      <w:bookmarkStart w:id="33" w:name="_Toc241609329"/>
       <w:r>
         <w:rPr>
           <w:rFonts w:ascii="Times New Roman" w:eastAsia="Times New Roman" w:hAnsi="Times New Roman" w:cs="Times New Roman"/>
@@ -7290,7 +7297,7 @@
       <w:pPr>
         <w:pStyle w:val="21"/>
       </w:pPr>
-      <w:bookmarkStart w:id="34" w:name="_Toc241565642"/>
+      <w:bookmarkStart w:id="34" w:name="_Toc241609330"/>
       <w:r>
         <w:rPr>
           <w:rFonts w:ascii="Times New Roman" w:eastAsia="Times New Roman" w:hAnsi="Times New Roman" w:cs="Times New Roman"/>
@@ -7312,7 +7319,7 @@
       <w:pPr>
         <w:pStyle w:val="1"/>
       </w:pPr>
-      <w:bookmarkStart w:id="35" w:name="_Toc241565643"/>
+      <w:bookmarkStart w:id="35" w:name="_Toc241609331"/>
       <w:r>
         <w:rPr>
           <w:rFonts w:ascii="Times New Roman" w:eastAsia="Times New Roman" w:hAnsi="Times New Roman" w:cs="Times New Roman"/>
@@ -7342,7 +7349,7 @@
       <w:pPr>
         <w:pStyle w:val="1"/>
       </w:pPr>
-      <w:bookmarkStart w:id="36" w:name="_Toc241565644"/>
+      <w:bookmarkStart w:id="36" w:name="_Toc241609332"/>
       <w:r>
         <w:rPr>
           <w:rFonts w:ascii="Times New Roman" w:eastAsia="Times New Roman" w:hAnsi="Times New Roman" w:cs="Times New Roman"/>
@@ -21462,7 +21469,7 @@
     <w:autoRedefine/>
     <w:uiPriority w:val="39"/>
     <w:unhideWhenUsed/>
-    <w:rsid w:val="00C55DD0"/>
+    <w:rsid w:val="006C0874"/>
     <w:pPr>
       <w:spacing w:after="100"/>
     </w:pPr>
@@ -21474,7 +21481,7 @@
     <w:autoRedefine/>
     <w:uiPriority w:val="39"/>
     <w:unhideWhenUsed/>
-    <w:rsid w:val="00C55DD0"/>
+    <w:rsid w:val="006C0874"/>
     <w:pPr>
       <w:spacing w:after="100"/>
       <w:ind w:left="280"/>
@@ -21485,7 +21492,7 @@
     <w:basedOn w:val="a2"/>
     <w:uiPriority w:val="99"/>
     <w:unhideWhenUsed/>
-    <w:rsid w:val="00C55DD0"/>
+    <w:rsid w:val="006C0874"/>
     <w:rPr>
       <w:color w:val="0000FF" w:themeColor="hyperlink"/>
       <w:u w:val="single"/>

</xml_diff>